<commit_message>
se agrego segundo formato
</commit_message>
<xml_diff>
--- a/src/assets/PlantillaDosEng.docx
+++ b/src/assets/PlantillaDosEng.docx
@@ -585,7 +585,6 @@
           <w:lang w:val="es-ES"/>
         </w:rPr>
       </w:pPr>
-      <w:bookmarkStart w:id="0" w:name="_GoBack"/>
       <w:r>
         <w:rPr>
           <w:rFonts w:ascii="Palatino Linotype" w:hAnsi="Palatino Linotype" w:cs="Calibri"/>
@@ -641,7 +640,6 @@
         <w:t>{periodo}</w:t>
       </w:r>
     </w:p>
-    <w:bookmarkEnd w:id="0"/>
     <w:p/>
     <w:p>
       <w:pPr>
@@ -757,7 +755,7 @@
               </wp:inline>
             </w:drawing>
           </mc:Choice>
-          <mc:Fallback xmlns:cx2="http://schemas.microsoft.com/office/drawing/2015/10/21/chartex" xmlns:cx3="http://schemas.microsoft.com/office/drawing/2016/5/9/chartex" xmlns:cx4="http://schemas.microsoft.com/office/drawing/2016/5/10/chartex" xmlns:cx5="http://schemas.microsoft.com/office/drawing/2016/5/11/chartex" xmlns:cx6="http://schemas.microsoft.com/office/drawing/2016/5/12/chartex" xmlns:cx7="http://schemas.microsoft.com/office/drawing/2016/5/13/chartex" xmlns:cx8="http://schemas.microsoft.com/office/drawing/2016/5/14/chartex" xmlns:aink="http://schemas.microsoft.com/office/drawing/2016/ink" xmlns:am3d="http://schemas.microsoft.com/office/drawing/2017/model3d" xmlns:oel="http://schemas.microsoft.com/office/2019/extlst" xmlns:w16cex="http://schemas.microsoft.com/office/word/2018/wordml/cex" xmlns:w16cid="http://schemas.microsoft.com/office/word/2016/wordml/cid" xmlns:w16="http://schemas.microsoft.com/office/word/2018/wordml" xmlns:w16sdtdh="http://schemas.microsoft.com/office/word/2020/wordml/sdtdatahash">
+          <mc:Fallback xmlns:w16sdtdh="http://schemas.microsoft.com/office/word/2020/wordml/sdtdatahash" xmlns:w16="http://schemas.microsoft.com/office/word/2018/wordml" xmlns:w16cid="http://schemas.microsoft.com/office/word/2016/wordml/cid" xmlns:w16cex="http://schemas.microsoft.com/office/word/2018/wordml/cex" xmlns:oel="http://schemas.microsoft.com/office/2019/extlst" xmlns:am3d="http://schemas.microsoft.com/office/drawing/2017/model3d" xmlns:aink="http://schemas.microsoft.com/office/drawing/2016/ink" xmlns:cx8="http://schemas.microsoft.com/office/drawing/2016/5/14/chartex" xmlns:cx7="http://schemas.microsoft.com/office/drawing/2016/5/13/chartex" xmlns:cx6="http://schemas.microsoft.com/office/drawing/2016/5/12/chartex" xmlns:cx5="http://schemas.microsoft.com/office/drawing/2016/5/11/chartex" xmlns:cx4="http://schemas.microsoft.com/office/drawing/2016/5/10/chartex" xmlns:cx3="http://schemas.microsoft.com/office/drawing/2016/5/9/chartex" xmlns:cx2="http://schemas.microsoft.com/office/drawing/2015/10/21/chartex">
             <w:pict>
               <v:line w14:anchorId="57E3896F" id="Conector recto 1" o:spid="_x0000_s1026" style="visibility:visible;mso-wrap-style:square;mso-left-percent:-10001;mso-top-percent:-10001;mso-position-horizontal:absolute;mso-position-horizontal-relative:char;mso-position-vertical:absolute;mso-position-vertical-relative:line;mso-left-percent:-10001;mso-top-percent:-10001" from="0,0" to="235.25pt,0" o:gfxdata="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" strokecolor="#adadad [2414]" strokeweight="1.5pt">
                 <v:stroke joinstyle="miter"/>
@@ -1017,7 +1015,7 @@
               </wp:inline>
             </w:drawing>
           </mc:Choice>
-          <mc:Fallback xmlns:cx2="http://schemas.microsoft.com/office/drawing/2015/10/21/chartex" xmlns:cx3="http://schemas.microsoft.com/office/drawing/2016/5/9/chartex" xmlns:cx4="http://schemas.microsoft.com/office/drawing/2016/5/10/chartex" xmlns:cx5="http://schemas.microsoft.com/office/drawing/2016/5/11/chartex" xmlns:cx6="http://schemas.microsoft.com/office/drawing/2016/5/12/chartex" xmlns:cx7="http://schemas.microsoft.com/office/drawing/2016/5/13/chartex" xmlns:cx8="http://schemas.microsoft.com/office/drawing/2016/5/14/chartex" xmlns:aink="http://schemas.microsoft.com/office/drawing/2016/ink" xmlns:am3d="http://schemas.microsoft.com/office/drawing/2017/model3d" xmlns:oel="http://schemas.microsoft.com/office/2019/extlst" xmlns:w16cex="http://schemas.microsoft.com/office/word/2018/wordml/cex" xmlns:w16cid="http://schemas.microsoft.com/office/word/2016/wordml/cid" xmlns:w16="http://schemas.microsoft.com/office/word/2018/wordml" xmlns:w16sdtdh="http://schemas.microsoft.com/office/word/2020/wordml/sdtdatahash">
+          <mc:Fallback xmlns:w16sdtdh="http://schemas.microsoft.com/office/word/2020/wordml/sdtdatahash" xmlns:w16="http://schemas.microsoft.com/office/word/2018/wordml" xmlns:w16cid="http://schemas.microsoft.com/office/word/2016/wordml/cid" xmlns:w16cex="http://schemas.microsoft.com/office/word/2018/wordml/cex" xmlns:oel="http://schemas.microsoft.com/office/2019/extlst" xmlns:am3d="http://schemas.microsoft.com/office/drawing/2017/model3d" xmlns:aink="http://schemas.microsoft.com/office/drawing/2016/ink" xmlns:cx8="http://schemas.microsoft.com/office/drawing/2016/5/14/chartex" xmlns:cx7="http://schemas.microsoft.com/office/drawing/2016/5/13/chartex" xmlns:cx6="http://schemas.microsoft.com/office/drawing/2016/5/12/chartex" xmlns:cx5="http://schemas.microsoft.com/office/drawing/2016/5/11/chartex" xmlns:cx4="http://schemas.microsoft.com/office/drawing/2016/5/10/chartex" xmlns:cx3="http://schemas.microsoft.com/office/drawing/2016/5/9/chartex" xmlns:cx2="http://schemas.microsoft.com/office/drawing/2015/10/21/chartex">
             <w:pict>
               <v:line w14:anchorId="72B42500" id="Conector recto 2" o:spid="_x0000_s1026" style="visibility:visible;mso-wrap-style:square;mso-left-percent:-10001;mso-top-percent:-10001;mso-position-horizontal:absolute;mso-position-horizontal-relative:char;mso-position-vertical:absolute;mso-position-vertical-relative:line;mso-left-percent:-10001;mso-top-percent:-10001" from="0,0" to="235.25pt,0" o:gfxdata="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" strokecolor="#adadad [2414]" strokeweight="1.5pt">
                 <v:stroke joinstyle="miter"/>
@@ -1179,6 +1177,39 @@
           <w:lang w:val="es-ES"/>
         </w:rPr>
       </w:pPr>
+      <w:r>
+        <w:rPr>
+          <w:rFonts w:ascii="Palatino Linotype" w:hAnsi="Palatino Linotype" w:cs="Calibri"/>
+          <w:kern w:val="0"/>
+          <w:sz w:val="22"/>
+          <w:szCs w:val="22"/>
+          <w:lang w:val="es-ES"/>
+          <w14:ligatures w14:val="none"/>
+        </w:rPr>
+        <w:t>Entity</w:t>
+      </w:r>
+      <w:bookmarkStart w:id="0" w:name="_GoBack"/>
+      <w:bookmarkEnd w:id="0"/>
+      <w:r>
+        <w:rPr>
+          <w:rFonts w:ascii="Palatino Linotype" w:hAnsi="Palatino Linotype" w:cs="Calibri"/>
+          <w:sz w:val="22"/>
+          <w:szCs w:val="22"/>
+          <w:lang w:val="es-ES"/>
+        </w:rPr>
+        <w:t>: {entidad}</w:t>
+      </w:r>
+    </w:p>
+    <w:p>
+      <w:pPr>
+        <w:spacing w:after="0"/>
+        <w:rPr>
+          <w:rFonts w:ascii="Palatino Linotype" w:hAnsi="Palatino Linotype" w:cs="Calibri"/>
+          <w:sz w:val="22"/>
+          <w:szCs w:val="22"/>
+          <w:lang w:val="es-ES"/>
+        </w:rPr>
+      </w:pPr>
       <w:proofErr w:type="spellStart"/>
       <w:r>
         <w:rPr>
@@ -1187,7 +1218,7 @@
           <w:szCs w:val="22"/>
           <w:lang w:val="es-ES"/>
         </w:rPr>
-        <w:t>Institution</w:t>
+        <w:t>Study</w:t>
       </w:r>
       <w:proofErr w:type="spellEnd"/>
       <w:r>
@@ -1197,50 +1228,8 @@
           <w:szCs w:val="22"/>
           <w:lang w:val="es-ES"/>
         </w:rPr>
-        <w:t>: {entidad}</w:t>
-      </w:r>
-    </w:p>
-    <w:p>
-      <w:pPr>
-        <w:spacing w:after="0"/>
-        <w:rPr>
-          <w:rFonts w:ascii="Palatino Linotype" w:hAnsi="Palatino Linotype" w:cs="Calibri"/>
-          <w:sz w:val="22"/>
-          <w:szCs w:val="22"/>
-          <w:lang w:val="es-ES"/>
-        </w:rPr>
-      </w:pPr>
-      <w:proofErr w:type="spellStart"/>
-      <w:r>
-        <w:rPr>
-          <w:rFonts w:ascii="Palatino Linotype" w:hAnsi="Palatino Linotype" w:cs="Calibri"/>
-          <w:sz w:val="22"/>
-          <w:szCs w:val="22"/>
-          <w:lang w:val="es-ES"/>
-        </w:rPr>
-        <w:t>Study</w:t>
-      </w:r>
-      <w:proofErr w:type="spellEnd"/>
-      <w:r>
-        <w:rPr>
-          <w:rFonts w:ascii="Palatino Linotype" w:hAnsi="Palatino Linotype" w:cs="Calibri"/>
-          <w:sz w:val="22"/>
-          <w:szCs w:val="22"/>
-          <w:lang w:val="es-ES"/>
-        </w:rPr>
-        <w:t xml:space="preserve"> </w:t>
-      </w:r>
-      <w:proofErr w:type="spellStart"/>
-      <w:r>
-        <w:rPr>
-          <w:rFonts w:ascii="Palatino Linotype" w:hAnsi="Palatino Linotype" w:cs="Calibri"/>
-          <w:sz w:val="22"/>
-          <w:szCs w:val="22"/>
-          <w:lang w:val="es-ES"/>
-        </w:rPr>
-        <w:t>Period</w:t>
-      </w:r>
-      <w:proofErr w:type="spellEnd"/>
+        <w:t xml:space="preserve"> Time</w:t>
+      </w:r>
       <w:r>
         <w:rPr>
           <w:rFonts w:ascii="Palatino Linotype" w:hAnsi="Palatino Linotype" w:cs="Calibri"/>
@@ -1432,7 +1421,7 @@
               </wp:inline>
             </w:drawing>
           </mc:Choice>
-          <mc:Fallback xmlns:cx2="http://schemas.microsoft.com/office/drawing/2015/10/21/chartex" xmlns:cx3="http://schemas.microsoft.com/office/drawing/2016/5/9/chartex" xmlns:cx4="http://schemas.microsoft.com/office/drawing/2016/5/10/chartex" xmlns:cx5="http://schemas.microsoft.com/office/drawing/2016/5/11/chartex" xmlns:cx6="http://schemas.microsoft.com/office/drawing/2016/5/12/chartex" xmlns:cx7="http://schemas.microsoft.com/office/drawing/2016/5/13/chartex" xmlns:cx8="http://schemas.microsoft.com/office/drawing/2016/5/14/chartex" xmlns:aink="http://schemas.microsoft.com/office/drawing/2016/ink" xmlns:am3d="http://schemas.microsoft.com/office/drawing/2017/model3d" xmlns:oel="http://schemas.microsoft.com/office/2019/extlst" xmlns:w16cex="http://schemas.microsoft.com/office/word/2018/wordml/cex" xmlns:w16cid="http://schemas.microsoft.com/office/word/2016/wordml/cid" xmlns:w16="http://schemas.microsoft.com/office/word/2018/wordml" xmlns:w16sdtdh="http://schemas.microsoft.com/office/word/2020/wordml/sdtdatahash">
+          <mc:Fallback xmlns:w16sdtdh="http://schemas.microsoft.com/office/word/2020/wordml/sdtdatahash" xmlns:w16="http://schemas.microsoft.com/office/word/2018/wordml" xmlns:w16cid="http://schemas.microsoft.com/office/word/2016/wordml/cid" xmlns:w16cex="http://schemas.microsoft.com/office/word/2018/wordml/cex" xmlns:oel="http://schemas.microsoft.com/office/2019/extlst" xmlns:am3d="http://schemas.microsoft.com/office/drawing/2017/model3d" xmlns:aink="http://schemas.microsoft.com/office/drawing/2016/ink" xmlns:cx8="http://schemas.microsoft.com/office/drawing/2016/5/14/chartex" xmlns:cx7="http://schemas.microsoft.com/office/drawing/2016/5/13/chartex" xmlns:cx6="http://schemas.microsoft.com/office/drawing/2016/5/12/chartex" xmlns:cx5="http://schemas.microsoft.com/office/drawing/2016/5/11/chartex" xmlns:cx4="http://schemas.microsoft.com/office/drawing/2016/5/10/chartex" xmlns:cx3="http://schemas.microsoft.com/office/drawing/2016/5/9/chartex" xmlns:cx2="http://schemas.microsoft.com/office/drawing/2015/10/21/chartex">
             <w:pict>
               <v:line w14:anchorId="19F6AE4F" id="Conector recto 3" o:spid="_x0000_s1026" style="visibility:visible;mso-wrap-style:square;mso-left-percent:-10001;mso-top-percent:-10001;mso-position-horizontal:absolute;mso-position-horizontal-relative:char;mso-position-vertical:absolute;mso-position-vertical-relative:line;mso-left-percent:-10001;mso-top-percent:-10001" from="0,0" to="235.25pt,0" o:gfxdata="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" strokecolor="#adadad [2414]" strokeweight="1.5pt">
                 <v:stroke joinstyle="miter"/>
@@ -1678,7 +1667,7 @@
               </wp:inline>
             </w:drawing>
           </mc:Choice>
-          <mc:Fallback xmlns:cx2="http://schemas.microsoft.com/office/drawing/2015/10/21/chartex" xmlns:cx3="http://schemas.microsoft.com/office/drawing/2016/5/9/chartex" xmlns:cx4="http://schemas.microsoft.com/office/drawing/2016/5/10/chartex" xmlns:cx5="http://schemas.microsoft.com/office/drawing/2016/5/11/chartex" xmlns:cx6="http://schemas.microsoft.com/office/drawing/2016/5/12/chartex" xmlns:cx7="http://schemas.microsoft.com/office/drawing/2016/5/13/chartex" xmlns:cx8="http://schemas.microsoft.com/office/drawing/2016/5/14/chartex" xmlns:aink="http://schemas.microsoft.com/office/drawing/2016/ink" xmlns:am3d="http://schemas.microsoft.com/office/drawing/2017/model3d" xmlns:oel="http://schemas.microsoft.com/office/2019/extlst" xmlns:w16cex="http://schemas.microsoft.com/office/word/2018/wordml/cex" xmlns:w16cid="http://schemas.microsoft.com/office/word/2016/wordml/cid" xmlns:w16="http://schemas.microsoft.com/office/word/2018/wordml" xmlns:w16sdtdh="http://schemas.microsoft.com/office/word/2020/wordml/sdtdatahash">
+          <mc:Fallback xmlns:w16sdtdh="http://schemas.microsoft.com/office/word/2020/wordml/sdtdatahash" xmlns:w16="http://schemas.microsoft.com/office/word/2018/wordml" xmlns:w16cid="http://schemas.microsoft.com/office/word/2016/wordml/cid" xmlns:w16cex="http://schemas.microsoft.com/office/word/2018/wordml/cex" xmlns:oel="http://schemas.microsoft.com/office/2019/extlst" xmlns:am3d="http://schemas.microsoft.com/office/drawing/2017/model3d" xmlns:aink="http://schemas.microsoft.com/office/drawing/2016/ink" xmlns:cx8="http://schemas.microsoft.com/office/drawing/2016/5/14/chartex" xmlns:cx7="http://schemas.microsoft.com/office/drawing/2016/5/13/chartex" xmlns:cx6="http://schemas.microsoft.com/office/drawing/2016/5/12/chartex" xmlns:cx5="http://schemas.microsoft.com/office/drawing/2016/5/11/chartex" xmlns:cx4="http://schemas.microsoft.com/office/drawing/2016/5/10/chartex" xmlns:cx3="http://schemas.microsoft.com/office/drawing/2016/5/9/chartex" xmlns:cx2="http://schemas.microsoft.com/office/drawing/2015/10/21/chartex">
             <w:pict>
               <v:line w14:anchorId="61138D0A" id="Conector recto 4" o:spid="_x0000_s1026" style="visibility:visible;mso-wrap-style:square;mso-left-percent:-10001;mso-top-percent:-10001;mso-position-horizontal:absolute;mso-position-horizontal-relative:char;mso-position-vertical:absolute;mso-position-vertical-relative:line;mso-left-percent:-10001;mso-top-percent:-10001" from="0,0" to="235.25pt,0" o:gfxdata="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" strokecolor="#adadad [2414]" strokeweight="1.5pt">
                 <v:stroke joinstyle="miter"/>

</xml_diff>